<commit_message>
Auto-fill sum-in-words in contracts
Adds a Russian number-to-words converter (with proper gender agreement
for тысяча) and wires it into the previously-blank "(пропись)"
parentheses in both Договор templates.

Co-Authored-By: Claude Sonnet 5 <noreply@anthropic.com>
</commit_message>
<xml_diff>
--- a/templates/dogovor_yul_template.docx
+++ b/templates/dogovor_yul_template.docx
@@ -1107,10 +1107,10 @@
           <w:sz w:val="24"/>
           <w:szCs w:val="24"/>
         </w:rPr>
-        <w:t xml:space="preserve">3.1. Полная стоимость образовательных услуг за весь период обучения составляет {DOG_SUM_TOTAL} (________________) рублей 00 копеек (НДС не облагается п.п.14 п.2 ст.149 НК РФ) за </w:t>
+        <w:t xml:space="preserve">3.1. Полная стоимость образовательных услуг за весь период обучения составляет {DOG_SUM_TOTAL} ({DOG_SUM_TOTAL_WORDS}) рублей 00 копеек (НДС не облагается п.п.14 п.2 ст.149 НК РФ) за </w:t>
         <w:tab/>
         <w:tab/>
-        <w:t xml:space="preserve"> слушателей. Стоимость обучения 1-го слушателя составляет {DOG_SUM_PERSON} (________________) рублей 00 копеек.</w:t>
+        <w:t xml:space="preserve"> слушателей. Стоимость обучения 1-го слушателя составляет {DOG_SUM_PERSON} ({DOG_SUM_PERSON_WORDS}) рублей 00 копеек.</w:t>
       </w:r>
     </w:p>
     <w:p>

</xml_diff>